<commit_message>
fix(m6-p3): re-author Gefo template as the real transportation invoice (26-001)
Wency sent his actual documents (2026-07-02): the real Gefo invoice is a
transportation invoice (Barge/Product/ports/tonnage × €/t/commission/VAT
reverse charge), not the crewing-services structure the placeholder was
authored from (26-047 is Novo Porto's shape). Rebuilt gefo.docx from the
real 26-001 sample, extended the fill/extraction/tool/exec seams with the
transport field set (European display amounts pass through verbatim), and
encoded the Gutschrift→invoice mapping rules (port reorder, German tonnage,
own YY-NNN numbering, voyage counter) in the tool schema + extractor prompt.
Filename now carries the voyage number per the real convention.

tsc 0 · 252 tests green (4 new: real-26-001 render fidelity, Gutschrift
verbatim amounts, transport-field pass-through, voyage filename).

Co-Authored-By: Claude Fable 5 <noreply@anthropic.com>
</commit_message>
<xml_diff>
--- a/assets/invoice-templates/gefo.docx
+++ b/assets/invoice-templates/gefo.docx
@@ -7,7 +7,7 @@
         <w:rPr>
           <w:b/>
         </w:rPr>
-        <w:t xml:space="preserve">Aquavoy Ltd</w:t>
+        <w:t xml:space="preserve">Aquavoy Shipping Ltd.</w:t>
       </w:r>
     </w:p>
     <w:p>
@@ -17,12 +17,17 @@
     </w:p>
     <w:p>
       <w:r>
-        <w:t xml:space="preserve">1011 Nicosia Cyprus</w:t>
+        <w:t xml:space="preserve">1011 Nicosia, Cyprus</w:t>
       </w:r>
     </w:p>
     <w:p>
       <w:r>
-        <w:t xml:space="preserve">VAT CY 60038875Q</w:t>
+        <w:t xml:space="preserve">V.A.T CY60038875Q</w:t>
+      </w:r>
+    </w:p>
+    <w:p>
+      <w:r>
+        <w:t xml:space="preserve">Registration Number HE 454167</w:t>
       </w:r>
     </w:p>
     <w:p>
@@ -45,7 +50,12 @@
     </w:p>
     <w:p>
       <w:r>
-        <w:t xml:space="preserve">VAT {recipient_vat}</w:t>
+        <w:t xml:space="preserve">V.A.T {recipient_vat}</w:t>
+      </w:r>
+    </w:p>
+    <w:p>
+      <w:r>
+        <w:t xml:space="preserve">Registration Number {recipient_reg}</w:t>
       </w:r>
     </w:p>
     <w:p>
@@ -55,12 +65,17 @@
     </w:p>
     <w:p>
       <w:r>
-        <w:t xml:space="preserve">Invoice Date {invoice_date}</w:t>
+        <w:t xml:space="preserve">Invoice Date: {invoice_date}</w:t>
       </w:r>
     </w:p>
     <w:p>
       <w:r>
-        <w:t xml:space="preserve">Invoice number {invoice_number}</w:t>
+        <w:t xml:space="preserve">Invoice Number: {invoice_number}</w:t>
+      </w:r>
+    </w:p>
+    <w:p>
+      <w:r>
+        <w:t xml:space="preserve">Voyage: {voyage_no}</w:t>
       </w:r>
     </w:p>
     <w:p>
@@ -70,12 +85,7 @@
     </w:p>
     <w:p>
       <w:r>
-        <w:t xml:space="preserve">Hereby we charge you for services rendered onboard of the Mts {vessel},</w:t>
-      </w:r>
-    </w:p>
-    <w:p>
-      <w:r>
-        <w:t xml:space="preserve">(voyage/layover period — see attached voyage/layover statement for details)</w:t>
+        <w:t xml:space="preserve">Hereby, we charge you for transportation services</w:t>
       </w:r>
     </w:p>
     <w:p>
@@ -85,35 +95,27 @@
     </w:p>
     <w:p>
       <w:r>
-        <w:t xml:space="preserve">Crewing Services        {crewing}</w:t>
+        <w:t xml:space="preserve">Barge                                Mts {vessel}</w:t>
       </w:r>
     </w:p>
     <w:p>
       <w:r>
-        <w:t xml:space="preserve">Travel Cost             {travel}</w:t>
+        <w:t xml:space="preserve">Product                              {product}</w:t>
       </w:r>
     </w:p>
     <w:p>
       <w:r>
-        <w:t xml:space="preserve">Service Fee (Food and Drink)  {service_fee}</w:t>
+        <w:t xml:space="preserve">Loading port / Discharge port        {load_port} / {discharge_port}</w:t>
       </w:r>
     </w:p>
     <w:p>
       <w:r>
-        <w:t xml:space="preserve">Cash advance            {cash_advance}-</w:t>
+        <w:t xml:space="preserve">Quantity / Price per ton             {tonnage} T x € {price_per_ton}          € {freight_amount}</w:t>
       </w:r>
     </w:p>
     <w:p>
       <w:r>
-        <w:t xml:space="preserve">VAT Shifted</w:t>
-      </w:r>
-    </w:p>
-    <w:p>
-      <w:r>
-        <w:rPr>
-          <w:b/>
-        </w:rPr>
-        <w:t xml:space="preserve">Total                   {total}</w:t>
+        <w:t xml:space="preserve">Commission {commission_pct} %                                                € {commission_amount}</w:t>
       </w:r>
     </w:p>
     <w:p>
@@ -123,17 +125,38 @@
     </w:p>
     <w:p>
       <w:r>
-        <w:t xml:space="preserve">Payment term: 7 days</w:t>
+        <w:rPr>
+          <w:b/>
+        </w:rPr>
+        <w:t xml:space="preserve">VAT REVERSE CHARGED BY RECIPIENT</w:t>
       </w:r>
     </w:p>
     <w:p>
       <w:r>
-        <w:t xml:space="preserve">Revolut Bank LT62 3250 0781 7194 2284  BIC Revolut21</w:t>
+        <w:rPr>
+          <w:b/>
+        </w:rPr>
+        <w:t xml:space="preserve">Total                                € {total}</w:t>
       </w:r>
     </w:p>
     <w:p>
       <w:r>
-        <w:t xml:space="preserve">Admin@aquavoy.com</w:t>
+        <w:t xml:space="preserve"/>
+      </w:r>
+    </w:p>
+    <w:p>
+      <w:r>
+        <w:t xml:space="preserve">Revolut Bank IBAN LT623250078171942284</w:t>
+      </w:r>
+    </w:p>
+    <w:p>
+      <w:r>
+        <w:t xml:space="preserve">Bic REVOLT21</w:t>
+      </w:r>
+    </w:p>
+    <w:p>
+      <w:r>
+        <w:t xml:space="preserve">Email Admin@aquavoy.com</w:t>
       </w:r>
     </w:p>
     <w:sectPr/>

</xml_diff>